<commit_message>
style: add more figures and tables
style: add more figures and tables
</commit_message>
<xml_diff>
--- a/По_частям/Часть_2_Глава_3.docx
+++ b/По_частям/Часть_2_Глава_3.docx
@@ -3667,6 +3667,918 @@
     </w:p>
     <w:p>
       <w:pPr>
+        <w:pStyle w:val="Основной текст"/>
+      </w:pPr>
+      <w:r>
+        <w:rPr/>
+        <w:t xml:space="preserve">Для удобства все ключевые показатели по шести сценариям сведены в таблицу 3.3.</w:t>
+      </w:r>
+    </w:p>
+    <w:p>
+      <w:pPr>
+        <w:pStyle w:val="Основной текст"/>
+      </w:pPr>
+      <w:r>
+        <w:rPr/>
+        <w:t xml:space="preserve">Таблица 3.3 - Сводные показатели эффективности по сценариям (энергетические и экономические)</w:t>
+      </w:r>
+    </w:p>
+    <w:tbl>
+      <w:tblPr>
+        <w:tblW w:w="9360" w:type="dxa"/>
+        <w:tblLook w:firstColumn="1" w:firstRow="1" w:lastColumn="0" w:lastRow="0" w:noHBand="0" w:noVBand="1" w:val="04A0"/>
+        <w:tblBorders>
+          <w:top w:val="single" w:sz="4" w:space="0" w:color="000000"/>
+          <w:left w:val="single" w:sz="4" w:space="0" w:color="000000"/>
+          <w:bottom w:val="single" w:sz="4" w:space="0" w:color="000000"/>
+          <w:right w:val="single" w:sz="4" w:space="0" w:color="000000"/>
+          <w:insideH w:val="single" w:sz="4" w:space="0" w:color="000000"/>
+          <w:insideV w:val="single" w:sz="4" w:space="0" w:color="000000"/>
+        </w:tblBorders>
+      </w:tblPr>
+      <w:tblGrid>
+        <w:gridCol w:w="1169"/>
+        <w:gridCol w:w="1169"/>
+        <w:gridCol w:w="1169"/>
+        <w:gridCol w:w="1169"/>
+        <w:gridCol w:w="1169"/>
+        <w:gridCol w:w="1169"/>
+        <w:gridCol w:w="1169"/>
+        <w:gridCol w:w="1169"/>
+      </w:tblGrid>
+      <w:tr>
+        <w:tc>
+          <w:tcPr>
+            <w:tcW w:type="dxa" w:w="1247"/>
+          </w:tcPr>
+          <w:p>
+            <w:pPr>
+              <w:jc w:val="center"/>
+            </w:pPr>
+            <w:r>
+              <w:rPr>
+                <w:b/>
+                <w:sz w:val="20"/>
+              </w:rPr>
+              <w:t>Сценарий</w:t>
+            </w:r>
+          </w:p>
+        </w:tc>
+        <w:tc>
+          <w:tcPr>
+            <w:tcW w:type="dxa" w:w="1134"/>
+          </w:tcPr>
+          <w:p>
+            <w:pPr>
+              <w:jc w:val="center"/>
+            </w:pPr>
+            <w:r>
+              <w:rPr>
+                <w:b/>
+                <w:sz w:val="20"/>
+              </w:rPr>
+              <w:t>E_год, кВт*ч</w:t>
+            </w:r>
+          </w:p>
+        </w:tc>
+        <w:tc>
+          <w:tcPr>
+            <w:tcW w:type="dxa" w:w="1134"/>
+          </w:tcPr>
+          <w:p>
+            <w:pPr>
+              <w:jc w:val="center"/>
+            </w:pPr>
+            <w:r>
+              <w:rPr>
+                <w:b/>
+                <w:sz w:val="20"/>
+              </w:rPr>
+              <w:t>Экономия, %</w:t>
+            </w:r>
+          </w:p>
+        </w:tc>
+        <w:tc>
+          <w:tcPr>
+            <w:tcW w:type="dxa" w:w="1304"/>
+          </w:tcPr>
+          <w:p>
+            <w:pPr>
+              <w:jc w:val="center"/>
+            </w:pPr>
+            <w:r>
+              <w:rPr>
+                <w:b/>
+                <w:sz w:val="20"/>
+              </w:rPr>
+              <w:t>CAPEX, руб.</w:t>
+            </w:r>
+          </w:p>
+        </w:tc>
+        <w:tc>
+          <w:tcPr>
+            <w:tcW w:type="dxa" w:w="1474"/>
+          </w:tcPr>
+          <w:p>
+            <w:pPr>
+              <w:jc w:val="center"/>
+            </w:pPr>
+            <w:r>
+              <w:rPr>
+                <w:b/>
+                <w:sz w:val="20"/>
+              </w:rPr>
+              <w:t>DeltaC, руб./год</w:t>
+            </w:r>
+          </w:p>
+        </w:tc>
+        <w:tc>
+          <w:tcPr>
+            <w:tcW w:type="dxa" w:w="907"/>
+          </w:tcPr>
+          <w:p>
+            <w:pPr>
+              <w:jc w:val="center"/>
+            </w:pPr>
+            <w:r>
+              <w:rPr>
+                <w:b/>
+                <w:sz w:val="20"/>
+              </w:rPr>
+              <w:t>PP, лет</w:t>
+            </w:r>
+          </w:p>
+        </w:tc>
+        <w:tc>
+          <w:tcPr>
+            <w:tcW w:type="dxa" w:w="1361"/>
+          </w:tcPr>
+          <w:p>
+            <w:pPr>
+              <w:jc w:val="center"/>
+            </w:pPr>
+            <w:r>
+              <w:rPr>
+                <w:b/>
+                <w:sz w:val="20"/>
+              </w:rPr>
+              <w:t>NPV, тыс. руб.</w:t>
+            </w:r>
+          </w:p>
+        </w:tc>
+        <w:tc>
+          <w:tcPr>
+            <w:tcW w:type="dxa" w:w="794"/>
+          </w:tcPr>
+          <w:p>
+            <w:pPr>
+              <w:jc w:val="center"/>
+            </w:pPr>
+            <w:r>
+              <w:rPr>
+                <w:b/>
+                <w:sz w:val="20"/>
+              </w:rPr>
+              <w:t>IRR, %</w:t>
+            </w:r>
+          </w:p>
+        </w:tc>
+      </w:tr>
+      <w:tr>
+        <w:tc>
+          <w:tcPr>
+            <w:tcW w:type="dxa" w:w="1247"/>
+          </w:tcPr>
+          <w:p>
+            <w:r>
+              <w:rPr>
+                <w:b w:val="0"/>
+                <w:sz w:val="20"/>
+              </w:rPr>
+              <w:t>1. База</w:t>
+            </w:r>
+          </w:p>
+        </w:tc>
+        <w:tc>
+          <w:tcPr>
+            <w:tcW w:type="dxa" w:w="1134"/>
+          </w:tcPr>
+          <w:p>
+            <w:r>
+              <w:rPr>
+                <w:b w:val="0"/>
+                <w:sz w:val="20"/>
+              </w:rPr>
+              <w:t>46 906</w:t>
+            </w:r>
+          </w:p>
+        </w:tc>
+        <w:tc>
+          <w:tcPr>
+            <w:tcW w:type="dxa" w:w="1134"/>
+          </w:tcPr>
+          <w:p>
+            <w:r>
+              <w:rPr>
+                <w:b w:val="0"/>
+                <w:sz w:val="20"/>
+              </w:rPr>
+              <w:t>-</w:t>
+            </w:r>
+          </w:p>
+        </w:tc>
+        <w:tc>
+          <w:tcPr>
+            <w:tcW w:type="dxa" w:w="1304"/>
+          </w:tcPr>
+          <w:p>
+            <w:r>
+              <w:rPr>
+                <w:b w:val="0"/>
+                <w:sz w:val="20"/>
+              </w:rPr>
+              <w:t>-</w:t>
+            </w:r>
+          </w:p>
+        </w:tc>
+        <w:tc>
+          <w:tcPr>
+            <w:tcW w:type="dxa" w:w="1474"/>
+          </w:tcPr>
+          <w:p>
+            <w:r>
+              <w:rPr>
+                <w:b w:val="0"/>
+                <w:sz w:val="20"/>
+              </w:rPr>
+              <w:t>-</w:t>
+            </w:r>
+          </w:p>
+        </w:tc>
+        <w:tc>
+          <w:tcPr>
+            <w:tcW w:type="dxa" w:w="907"/>
+          </w:tcPr>
+          <w:p>
+            <w:r>
+              <w:rPr>
+                <w:b w:val="0"/>
+                <w:sz w:val="20"/>
+              </w:rPr>
+              <w:t>-</w:t>
+            </w:r>
+          </w:p>
+        </w:tc>
+        <w:tc>
+          <w:tcPr>
+            <w:tcW w:type="dxa" w:w="1361"/>
+          </w:tcPr>
+          <w:p>
+            <w:r>
+              <w:rPr>
+                <w:b w:val="0"/>
+                <w:sz w:val="20"/>
+              </w:rPr>
+              <w:t>-</w:t>
+            </w:r>
+          </w:p>
+        </w:tc>
+        <w:tc>
+          <w:tcPr>
+            <w:tcW w:type="dxa" w:w="794"/>
+          </w:tcPr>
+          <w:p>
+            <w:r>
+              <w:rPr>
+                <w:b w:val="0"/>
+                <w:sz w:val="20"/>
+              </w:rPr>
+              <w:t>-</w:t>
+            </w:r>
+          </w:p>
+        </w:tc>
+      </w:tr>
+      <w:tr>
+        <w:tc>
+          <w:tcPr>
+            <w:tcW w:type="dxa" w:w="1247"/>
+          </w:tcPr>
+          <w:p>
+            <w:r>
+              <w:rPr>
+                <w:b w:val="0"/>
+                <w:sz w:val="20"/>
+              </w:rPr>
+              <w:t>2. Рекуп+</w:t>
+            </w:r>
+          </w:p>
+        </w:tc>
+        <w:tc>
+          <w:tcPr>
+            <w:tcW w:type="dxa" w:w="1134"/>
+          </w:tcPr>
+          <w:p>
+            <w:r>
+              <w:rPr>
+                <w:b w:val="0"/>
+                <w:sz w:val="20"/>
+              </w:rPr>
+              <w:t>32 236</w:t>
+            </w:r>
+          </w:p>
+        </w:tc>
+        <w:tc>
+          <w:tcPr>
+            <w:tcW w:type="dxa" w:w="1134"/>
+          </w:tcPr>
+          <w:p>
+            <w:r>
+              <w:rPr>
+                <w:b w:val="0"/>
+                <w:sz w:val="20"/>
+              </w:rPr>
+              <w:t>31,3</w:t>
+            </w:r>
+          </w:p>
+        </w:tc>
+        <w:tc>
+          <w:tcPr>
+            <w:tcW w:type="dxa" w:w="1304"/>
+          </w:tcPr>
+          <w:p>
+            <w:r>
+              <w:rPr>
+                <w:b w:val="0"/>
+                <w:sz w:val="20"/>
+              </w:rPr>
+              <w:t>175 000</w:t>
+            </w:r>
+          </w:p>
+        </w:tc>
+        <w:tc>
+          <w:tcPr>
+            <w:tcW w:type="dxa" w:w="1474"/>
+          </w:tcPr>
+          <w:p>
+            <w:r>
+              <w:rPr>
+                <w:b w:val="0"/>
+                <w:sz w:val="20"/>
+              </w:rPr>
+              <w:t>126 749</w:t>
+            </w:r>
+          </w:p>
+        </w:tc>
+        <w:tc>
+          <w:tcPr>
+            <w:tcW w:type="dxa" w:w="907"/>
+          </w:tcPr>
+          <w:p>
+            <w:r>
+              <w:rPr>
+                <w:b w:val="0"/>
+                <w:sz w:val="20"/>
+              </w:rPr>
+              <w:t>1,38</w:t>
+            </w:r>
+          </w:p>
+        </w:tc>
+        <w:tc>
+          <w:tcPr>
+            <w:tcW w:type="dxa" w:w="1361"/>
+          </w:tcPr>
+          <w:p>
+            <w:r>
+              <w:rPr>
+                <w:b w:val="0"/>
+                <w:sz w:val="20"/>
+              </w:rPr>
+              <w:t>603</w:t>
+            </w:r>
+          </w:p>
+        </w:tc>
+        <w:tc>
+          <w:tcPr>
+            <w:tcW w:type="dxa" w:w="794"/>
+          </w:tcPr>
+          <w:p>
+            <w:r>
+              <w:rPr>
+                <w:b w:val="0"/>
+                <w:sz w:val="20"/>
+              </w:rPr>
+              <w:t>73</w:t>
+            </w:r>
+          </w:p>
+        </w:tc>
+      </w:tr>
+      <w:tr>
+        <w:tc>
+          <w:tcPr>
+            <w:tcW w:type="dxa" w:w="1247"/>
+          </w:tcPr>
+          <w:p>
+            <w:r>
+              <w:rPr>
+                <w:b w:val="0"/>
+                <w:sz w:val="20"/>
+              </w:rPr>
+              <w:t>3. ТН</w:t>
+            </w:r>
+          </w:p>
+        </w:tc>
+        <w:tc>
+          <w:tcPr>
+            <w:tcW w:type="dxa" w:w="1134"/>
+          </w:tcPr>
+          <w:p>
+            <w:r>
+              <w:rPr>
+                <w:b w:val="0"/>
+                <w:sz w:val="20"/>
+              </w:rPr>
+              <w:t>23 036</w:t>
+            </w:r>
+          </w:p>
+        </w:tc>
+        <w:tc>
+          <w:tcPr>
+            <w:tcW w:type="dxa" w:w="1134"/>
+          </w:tcPr>
+          <w:p>
+            <w:r>
+              <w:rPr>
+                <w:b w:val="0"/>
+                <w:sz w:val="20"/>
+              </w:rPr>
+              <w:t>50,9</w:t>
+            </w:r>
+          </w:p>
+        </w:tc>
+        <w:tc>
+          <w:tcPr>
+            <w:tcW w:type="dxa" w:w="1304"/>
+          </w:tcPr>
+          <w:p>
+            <w:r>
+              <w:rPr>
+                <w:b w:val="0"/>
+                <w:sz w:val="20"/>
+              </w:rPr>
+              <w:t>430 000</w:t>
+            </w:r>
+          </w:p>
+        </w:tc>
+        <w:tc>
+          <w:tcPr>
+            <w:tcW w:type="dxa" w:w="1474"/>
+          </w:tcPr>
+          <w:p>
+            <w:r>
+              <w:rPr>
+                <w:b w:val="0"/>
+                <w:sz w:val="20"/>
+              </w:rPr>
+              <w:t>206 237</w:t>
+            </w:r>
+          </w:p>
+        </w:tc>
+        <w:tc>
+          <w:tcPr>
+            <w:tcW w:type="dxa" w:w="907"/>
+          </w:tcPr>
+          <w:p>
+            <w:r>
+              <w:rPr>
+                <w:b w:val="0"/>
+                <w:sz w:val="20"/>
+              </w:rPr>
+              <w:t>2,09</w:t>
+            </w:r>
+          </w:p>
+        </w:tc>
+        <w:tc>
+          <w:tcPr>
+            <w:tcW w:type="dxa" w:w="1361"/>
+          </w:tcPr>
+          <w:p>
+            <w:r>
+              <w:rPr>
+                <w:b w:val="0"/>
+                <w:sz w:val="20"/>
+              </w:rPr>
+              <w:t>837</w:t>
+            </w:r>
+          </w:p>
+        </w:tc>
+        <w:tc>
+          <w:tcPr>
+            <w:tcW w:type="dxa" w:w="794"/>
+          </w:tcPr>
+          <w:p>
+            <w:r>
+              <w:rPr>
+                <w:b w:val="0"/>
+                <w:sz w:val="20"/>
+              </w:rPr>
+              <w:t>48</w:t>
+            </w:r>
+          </w:p>
+        </w:tc>
+      </w:tr>
+      <w:tr>
+        <w:tc>
+          <w:tcPr>
+            <w:tcW w:type="dxa" w:w="1247"/>
+          </w:tcPr>
+          <w:p>
+            <w:r>
+              <w:rPr>
+                <w:b w:val="0"/>
+                <w:sz w:val="20"/>
+              </w:rPr>
+              <w:t>4. DCV</w:t>
+            </w:r>
+          </w:p>
+        </w:tc>
+        <w:tc>
+          <w:tcPr>
+            <w:tcW w:type="dxa" w:w="1134"/>
+          </w:tcPr>
+          <w:p>
+            <w:r>
+              <w:rPr>
+                <w:b w:val="0"/>
+                <w:sz w:val="20"/>
+              </w:rPr>
+              <w:t>20 264</w:t>
+            </w:r>
+          </w:p>
+        </w:tc>
+        <w:tc>
+          <w:tcPr>
+            <w:tcW w:type="dxa" w:w="1134"/>
+          </w:tcPr>
+          <w:p>
+            <w:r>
+              <w:rPr>
+                <w:b w:val="0"/>
+                <w:sz w:val="20"/>
+              </w:rPr>
+              <w:t>56,8</w:t>
+            </w:r>
+          </w:p>
+        </w:tc>
+        <w:tc>
+          <w:tcPr>
+            <w:tcW w:type="dxa" w:w="1304"/>
+          </w:tcPr>
+          <w:p>
+            <w:r>
+              <w:rPr>
+                <w:b w:val="0"/>
+                <w:sz w:val="20"/>
+              </w:rPr>
+              <w:t>160 000</w:t>
+            </w:r>
+          </w:p>
+        </w:tc>
+        <w:tc>
+          <w:tcPr>
+            <w:tcW w:type="dxa" w:w="1474"/>
+          </w:tcPr>
+          <w:p>
+            <w:r>
+              <w:rPr>
+                <w:b w:val="0"/>
+                <w:sz w:val="20"/>
+              </w:rPr>
+              <w:t>230 187</w:t>
+            </w:r>
+          </w:p>
+        </w:tc>
+        <w:tc>
+          <w:tcPr>
+            <w:tcW w:type="dxa" w:w="907"/>
+          </w:tcPr>
+          <w:p>
+            <w:r>
+              <w:rPr>
+                <w:b w:val="0"/>
+                <w:sz w:val="20"/>
+              </w:rPr>
+              <w:t>0,70</w:t>
+            </w:r>
+          </w:p>
+        </w:tc>
+        <w:tc>
+          <w:tcPr>
+            <w:tcW w:type="dxa" w:w="1361"/>
+          </w:tcPr>
+          <w:p>
+            <w:r>
+              <w:rPr>
+                <w:b w:val="0"/>
+                <w:sz w:val="20"/>
+              </w:rPr>
+              <w:t>1 254</w:t>
+            </w:r>
+          </w:p>
+        </w:tc>
+        <w:tc>
+          <w:tcPr>
+            <w:tcW w:type="dxa" w:w="794"/>
+          </w:tcPr>
+          <w:p>
+            <w:r>
+              <w:rPr>
+                <w:b w:val="0"/>
+                <w:sz w:val="20"/>
+              </w:rPr>
+              <w:t>144</w:t>
+            </w:r>
+          </w:p>
+        </w:tc>
+      </w:tr>
+      <w:tr>
+        <w:tc>
+          <w:tcPr>
+            <w:tcW w:type="dxa" w:w="1247"/>
+          </w:tcPr>
+          <w:p>
+            <w:r>
+              <w:rPr>
+                <w:b w:val="0"/>
+                <w:sz w:val="20"/>
+              </w:rPr>
+              <w:t>5. DCV+Рекуп+</w:t>
+            </w:r>
+          </w:p>
+        </w:tc>
+        <w:tc>
+          <w:tcPr>
+            <w:tcW w:type="dxa" w:w="1134"/>
+          </w:tcPr>
+          <w:p>
+            <w:r>
+              <w:rPr>
+                <w:b w:val="0"/>
+                <w:sz w:val="20"/>
+              </w:rPr>
+              <w:t>14 699</w:t>
+            </w:r>
+          </w:p>
+        </w:tc>
+        <w:tc>
+          <w:tcPr>
+            <w:tcW w:type="dxa" w:w="1134"/>
+          </w:tcPr>
+          <w:p>
+            <w:r>
+              <w:rPr>
+                <w:b w:val="0"/>
+                <w:sz w:val="20"/>
+              </w:rPr>
+              <w:t>68,7</w:t>
+            </w:r>
+          </w:p>
+        </w:tc>
+        <w:tc>
+          <w:tcPr>
+            <w:tcW w:type="dxa" w:w="1304"/>
+          </w:tcPr>
+          <w:p>
+            <w:r>
+              <w:rPr>
+                <w:b w:val="0"/>
+                <w:sz w:val="20"/>
+              </w:rPr>
+              <w:t>335 000</w:t>
+            </w:r>
+          </w:p>
+        </w:tc>
+        <w:tc>
+          <w:tcPr>
+            <w:tcW w:type="dxa" w:w="1474"/>
+          </w:tcPr>
+          <w:p>
+            <w:r>
+              <w:rPr>
+                <w:b w:val="0"/>
+                <w:sz w:val="20"/>
+              </w:rPr>
+              <w:t>278 268</w:t>
+            </w:r>
+          </w:p>
+        </w:tc>
+        <w:tc>
+          <w:tcPr>
+            <w:tcW w:type="dxa" w:w="907"/>
+          </w:tcPr>
+          <w:p>
+            <w:r>
+              <w:rPr>
+                <w:b w:val="0"/>
+                <w:sz w:val="20"/>
+              </w:rPr>
+              <w:t>1,20</w:t>
+            </w:r>
+          </w:p>
+        </w:tc>
+        <w:tc>
+          <w:tcPr>
+            <w:tcW w:type="dxa" w:w="1361"/>
+          </w:tcPr>
+          <w:p>
+            <w:r>
+              <w:rPr>
+                <w:b w:val="0"/>
+                <w:sz w:val="20"/>
+              </w:rPr>
+              <w:t>1 375</w:t>
+            </w:r>
+          </w:p>
+        </w:tc>
+        <w:tc>
+          <w:tcPr>
+            <w:tcW w:type="dxa" w:w="794"/>
+          </w:tcPr>
+          <w:p>
+            <w:r>
+              <w:rPr>
+                <w:b w:val="0"/>
+                <w:sz w:val="20"/>
+              </w:rPr>
+              <w:t>83</w:t>
+            </w:r>
+          </w:p>
+        </w:tc>
+      </w:tr>
+      <w:tr>
+        <w:tc>
+          <w:tcPr>
+            <w:tcW w:type="dxa" w:w="1247"/>
+          </w:tcPr>
+          <w:p>
+            <w:r>
+              <w:rPr>
+                <w:b w:val="0"/>
+                <w:sz w:val="20"/>
+              </w:rPr>
+              <w:t>6. DCV+ТН</w:t>
+            </w:r>
+          </w:p>
+        </w:tc>
+        <w:tc>
+          <w:tcPr>
+            <w:tcW w:type="dxa" w:w="1134"/>
+          </w:tcPr>
+          <w:p>
+            <w:r>
+              <w:rPr>
+                <w:b w:val="0"/>
+                <w:sz w:val="20"/>
+              </w:rPr>
+              <w:t>11 343</w:t>
+            </w:r>
+          </w:p>
+        </w:tc>
+        <w:tc>
+          <w:tcPr>
+            <w:tcW w:type="dxa" w:w="1134"/>
+          </w:tcPr>
+          <w:p>
+            <w:r>
+              <w:rPr>
+                <w:b w:val="0"/>
+                <w:sz w:val="20"/>
+              </w:rPr>
+              <w:t>75,8</w:t>
+            </w:r>
+          </w:p>
+        </w:tc>
+        <w:tc>
+          <w:tcPr>
+            <w:tcW w:type="dxa" w:w="1304"/>
+          </w:tcPr>
+          <w:p>
+            <w:r>
+              <w:rPr>
+                <w:b w:val="0"/>
+                <w:sz w:val="20"/>
+              </w:rPr>
+              <w:t>590 000</w:t>
+            </w:r>
+          </w:p>
+        </w:tc>
+        <w:tc>
+          <w:tcPr>
+            <w:tcW w:type="dxa" w:w="1474"/>
+          </w:tcPr>
+          <w:p>
+            <w:r>
+              <w:rPr>
+                <w:b w:val="0"/>
+                <w:sz w:val="20"/>
+              </w:rPr>
+              <w:t>307 264</w:t>
+            </w:r>
+          </w:p>
+        </w:tc>
+        <w:tc>
+          <w:tcPr>
+            <w:tcW w:type="dxa" w:w="907"/>
+          </w:tcPr>
+          <w:p>
+            <w:r>
+              <w:rPr>
+                <w:b w:val="0"/>
+                <w:sz w:val="20"/>
+              </w:rPr>
+              <w:t>1,92</w:t>
+            </w:r>
+          </w:p>
+        </w:tc>
+        <w:tc>
+          <w:tcPr>
+            <w:tcW w:type="dxa" w:w="1361"/>
+          </w:tcPr>
+          <w:p>
+            <w:r>
+              <w:rPr>
+                <w:b w:val="0"/>
+                <w:sz w:val="20"/>
+              </w:rPr>
+              <w:t>1 298</w:t>
+            </w:r>
+          </w:p>
+        </w:tc>
+        <w:tc>
+          <w:tcPr>
+            <w:tcW w:type="dxa" w:w="794"/>
+          </w:tcPr>
+          <w:p>
+            <w:r>
+              <w:rPr>
+                <w:b w:val="0"/>
+                <w:sz w:val="20"/>
+              </w:rPr>
+              <w:t>52</w:t>
+            </w:r>
+          </w:p>
+        </w:tc>
+      </w:tr>
+    </w:tbl>
+    <w:p>
+      <w:pPr>
+        <w:pStyle w:val="Основной текст"/>
+      </w:pPr>
+      <w:r>
+        <w:rPr/>
+        <w:t xml:space="preserve">DeltaC - годовая экономия в рублях при тарифе 8,64 руб./кВт*ч. PP - простой срок окупаемости. NPV - за 10 лет, ставка дисконтирования 10 %. Для базового сценария CAPEX/PP/NPV/IRR не рассчитываются (-). * - в сценарии ТН E_нагр - мощность компрессора ТН, а не прямого нагревателя.</w:t>
+      </w:r>
+    </w:p>
+    <w:p>
+      <w:pPr>
+        <w:jc w:val="center"/>
+      </w:pPr>
+      <w:r>
+        <w:drawing>
+          <wp:inline xmlns:a="http://schemas.openxmlformats.org/drawingml/2006/main" xmlns:pic="http://schemas.openxmlformats.org/drawingml/2006/picture">
+            <wp:extent cx="4500000" cy="2210127"/>
+            <wp:docPr id="1" name="Picture 1"/>
+            <wp:cNvGraphicFramePr>
+              <a:graphicFrameLocks noChangeAspect="1"/>
+            </wp:cNvGraphicFramePr>
+            <a:graphic>
+              <a:graphicData uri="http://schemas.openxmlformats.org/drawingml/2006/picture">
+                <pic:pic>
+                  <pic:nvPicPr>
+                    <pic:cNvPr id="0" name="ris31_payback.png"/>
+                    <pic:cNvPicPr/>
+                  </pic:nvPicPr>
+                  <pic:blipFill>
+                    <a:blip r:embed="rId9"/>
+                    <a:stretch>
+                      <a:fillRect/>
+                    </a:stretch>
+                  </pic:blipFill>
+                  <pic:spPr>
+                    <a:xfrm>
+                      <a:off x="0" y="0"/>
+                      <a:ext cx="4500000" cy="2210127"/>
+                    </a:xfrm>
+                    <a:prstGeom prst="rect"/>
+                  </pic:spPr>
+                </pic:pic>
+              </a:graphicData>
+            </a:graphic>
+          </wp:inline>
+        </w:drawing>
+      </w:r>
+    </w:p>
+    <w:p>
+      <w:pPr>
         <w:spacing w:line="360" w:lineRule="auto"/>
         <w:ind w:firstLine="0"/>
         <w:jc w:val="both"/>
@@ -3678,6 +4590,45 @@
           <w:color w:val="000000"/>
         </w:rPr>
         <w:t>Рисунок 3.1 - Сравнительная диаграмма срока окупаемости капитальных затрат по сценариям</w:t>
+      </w:r>
+    </w:p>
+    <w:p>
+      <w:pPr>
+        <w:jc w:val="center"/>
+      </w:pPr>
+      <w:r>
+        <w:drawing>
+          <wp:inline xmlns:a="http://schemas.openxmlformats.org/drawingml/2006/main" xmlns:pic="http://schemas.openxmlformats.org/drawingml/2006/picture">
+            <wp:extent cx="4500000" cy="2211993"/>
+            <wp:docPr id="2" name="Picture 2"/>
+            <wp:cNvGraphicFramePr>
+              <a:graphicFrameLocks noChangeAspect="1"/>
+            </wp:cNvGraphicFramePr>
+            <a:graphic>
+              <a:graphicData uri="http://schemas.openxmlformats.org/drawingml/2006/picture">
+                <pic:pic>
+                  <pic:nvPicPr>
+                    <pic:cNvPr id="0" name="ris32_npv.png"/>
+                    <pic:cNvPicPr/>
+                  </pic:nvPicPr>
+                  <pic:blipFill>
+                    <a:blip r:embed="rId10"/>
+                    <a:stretch>
+                      <a:fillRect/>
+                    </a:stretch>
+                  </pic:blipFill>
+                  <pic:spPr>
+                    <a:xfrm>
+                      <a:off x="0" y="0"/>
+                      <a:ext cx="4500000" cy="2211993"/>
+                    </a:xfrm>
+                    <a:prstGeom prst="rect"/>
+                  </pic:spPr>
+                </pic:pic>
+              </a:graphicData>
+            </a:graphic>
+          </wp:inline>
+        </w:drawing>
       </w:r>
     </w:p>
     <w:p>
@@ -3913,6 +4864,45 @@
     </w:p>
     <w:p>
       <w:pPr>
+        <w:jc w:val="center"/>
+      </w:pPr>
+      <w:r>
+        <w:drawing>
+          <wp:inline xmlns:a="http://schemas.openxmlformats.org/drawingml/2006/main" xmlns:pic="http://schemas.openxmlformats.org/drawingml/2006/picture">
+            <wp:extent cx="5220000" cy="2573091"/>
+            <wp:docPr id="3" name="Picture 3"/>
+            <wp:cNvGraphicFramePr>
+              <a:graphicFrameLocks noChangeAspect="1"/>
+            </wp:cNvGraphicFramePr>
+            <a:graphic>
+              <a:graphicData uri="http://schemas.openxmlformats.org/drawingml/2006/picture">
+                <pic:pic>
+                  <pic:nvPicPr>
+                    <pic:cNvPr id="0" name="ris33_structure.png"/>
+                    <pic:cNvPicPr/>
+                  </pic:nvPicPr>
+                  <pic:blipFill>
+                    <a:blip r:embed="rId11"/>
+                    <a:stretch>
+                      <a:fillRect/>
+                    </a:stretch>
+                  </pic:blipFill>
+                  <pic:spPr>
+                    <a:xfrm>
+                      <a:off x="0" y="0"/>
+                      <a:ext cx="5220000" cy="2573091"/>
+                    </a:xfrm>
+                    <a:prstGeom prst="rect"/>
+                  </pic:spPr>
+                </pic:pic>
+              </a:graphicData>
+            </a:graphic>
+          </wp:inline>
+        </w:drawing>
+      </w:r>
+    </w:p>
+    <w:p>
+      <w:pPr>
         <w:spacing w:line="360" w:lineRule="auto"/>
         <w:ind w:firstLine="0"/>
         <w:jc w:val="both"/>
@@ -3924,6 +4914,45 @@
           <w:color w:val="000000"/>
         </w:rPr>
         <w:t>Рисунок 3.3 - Структура электропотребления по сценариям: вентиляторы / нагрев / прочее (кВт*ч/год)</w:t>
+      </w:r>
+    </w:p>
+    <w:p>
+      <w:pPr>
+        <w:jc w:val="center"/>
+      </w:pPr>
+      <w:r>
+        <w:drawing>
+          <wp:inline xmlns:a="http://schemas.openxmlformats.org/drawingml/2006/main" xmlns:pic="http://schemas.openxmlformats.org/drawingml/2006/picture">
+            <wp:extent cx="5220000" cy="2316485"/>
+            <wp:docPr id="4" name="Picture 4"/>
+            <wp:cNvGraphicFramePr>
+              <a:graphicFrameLocks noChangeAspect="1"/>
+            </wp:cNvGraphicFramePr>
+            <a:graphic>
+              <a:graphicData uri="http://schemas.openxmlformats.org/drawingml/2006/picture">
+                <pic:pic>
+                  <pic:nvPicPr>
+                    <pic:cNvPr id="0" name="ris34_monthly_compare.png"/>
+                    <pic:cNvPicPr/>
+                  </pic:nvPicPr>
+                  <pic:blipFill>
+                    <a:blip r:embed="rId12"/>
+                    <a:stretch>
+                      <a:fillRect/>
+                    </a:stretch>
+                  </pic:blipFill>
+                  <pic:spPr>
+                    <a:xfrm>
+                      <a:off x="0" y="0"/>
+                      <a:ext cx="5220000" cy="2316485"/>
+                    </a:xfrm>
+                    <a:prstGeom prst="rect"/>
+                  </pic:spPr>
+                </pic:pic>
+              </a:graphicData>
+            </a:graphic>
+          </wp:inline>
+        </w:drawing>
       </w:r>
     </w:p>
     <w:p>
@@ -3940,6 +4969,45 @@
           <w:sz w:val="28"/>
         </w:rPr>
         <w:t>Рисунок 3.4 - Экономия электроэнергии по месяцам: сценарии Base vs DCV (по данным OpenStudio)</w:t>
+      </w:r>
+    </w:p>
+    <w:p>
+      <w:pPr>
+        <w:jc w:val="center"/>
+      </w:pPr>
+      <w:r>
+        <w:drawing>
+          <wp:inline xmlns:a="http://schemas.openxmlformats.org/drawingml/2006/main" xmlns:pic="http://schemas.openxmlformats.org/drawingml/2006/picture">
+            <wp:extent cx="5040000" cy="3193541"/>
+            <wp:docPr id="5" name="Picture 5"/>
+            <wp:cNvGraphicFramePr>
+              <a:graphicFrameLocks noChangeAspect="1"/>
+            </wp:cNvGraphicFramePr>
+            <a:graphic>
+              <a:graphicData uri="http://schemas.openxmlformats.org/drawingml/2006/picture">
+                <pic:pic>
+                  <pic:nvPicPr>
+                    <pic:cNvPr id="0" name="ris35_co2_annual.png"/>
+                    <pic:cNvPicPr/>
+                  </pic:nvPicPr>
+                  <pic:blipFill>
+                    <a:blip r:embed="rId13"/>
+                    <a:stretch>
+                      <a:fillRect/>
+                    </a:stretch>
+                  </pic:blipFill>
+                  <pic:spPr>
+                    <a:xfrm>
+                      <a:off x="0" y="0"/>
+                      <a:ext cx="5040000" cy="3193541"/>
+                    </a:xfrm>
+                    <a:prstGeom prst="rect"/>
+                  </pic:spPr>
+                </pic:pic>
+              </a:graphicData>
+            </a:graphic>
+          </wp:inline>
+        </w:drawing>
       </w:r>
     </w:p>
     <w:p>
@@ -5153,7 +6221,7 @@
     </w:rPrDefault>
     <w:pPrDefault>
       <w:pPr>
-        <w:spacing w:after="200" w:line="276" w:lineRule="auto"/>
+        <w:spacing w:before="0" w:beforeAutospacing="0" w:after="0" w:afterAutospacing="0" w:line="360" w:lineRule="auto"/>
       </w:pPr>
     </w:pPrDefault>
   </w:docDefaults>

</xml_diff>